<commit_message>
Bump to Alpha 0.7.9 "Electric Chair"
Version increment across all PHP file headers, core/constants.php,
and CLAUDE.md. No logic changes — headers only.

Co-Authored-By: Claude Sonnet 4.6 <noreply@anthropic.com>
</commit_message>
<xml_diff>
--- a/tools/Smack-It-Back-Up-Spec.docx
+++ b/tools/Smack-It-Back-Up-Spec.docx
@@ -304,12 +304,6 @@
         <w:gridCol w:w="2400"/>
       </w:tblGrid>
       <w:tr>
-        <w:tblPrEx>
-          <w:tblCellMar>
-            <w:top w:w="0" w:type="dxa"/>
-            <w:bottom w:w="0" w:type="dxa"/>
-          </w:tblCellMar>
-        </w:tblPrEx>
         <w:tc>
           <w:tcPr>
             <w:tcW w:w="2800" w:type="dxa"/>
@@ -402,12 +396,6 @@
         </w:tc>
       </w:tr>
       <w:tr>
-        <w:tblPrEx>
-          <w:tblCellMar>
-            <w:top w:w="0" w:type="dxa"/>
-            <w:bottom w:w="0" w:type="dxa"/>
-          </w:tblCellMar>
-        </w:tblPrEx>
         <w:tc>
           <w:tcPr>
             <w:tcW w:w="2800" w:type="dxa"/>
@@ -481,12 +469,6 @@
         </w:tc>
       </w:tr>
       <w:tr>
-        <w:tblPrEx>
-          <w:tblCellMar>
-            <w:top w:w="0" w:type="dxa"/>
-            <w:bottom w:w="0" w:type="dxa"/>
-          </w:tblCellMar>
-        </w:tblPrEx>
         <w:tc>
           <w:tcPr>
             <w:tcW w:w="2800" w:type="dxa"/>
@@ -563,12 +545,6 @@
         </w:tc>
       </w:tr>
       <w:tr>
-        <w:tblPrEx>
-          <w:tblCellMar>
-            <w:top w:w="0" w:type="dxa"/>
-            <w:bottom w:w="0" w:type="dxa"/>
-          </w:tblCellMar>
-        </w:tblPrEx>
         <w:tc>
           <w:tcPr>
             <w:tcW w:w="2800" w:type="dxa"/>
@@ -709,12 +685,6 @@
         <w:gridCol w:w="6160"/>
       </w:tblGrid>
       <w:tr>
-        <w:tblPrEx>
-          <w:tblCellMar>
-            <w:top w:w="0" w:type="dxa"/>
-            <w:bottom w:w="0" w:type="dxa"/>
-          </w:tblCellMar>
-        </w:tblPrEx>
         <w:tc>
           <w:tcPr>
             <w:tcW w:w="3200" w:type="dxa"/>
@@ -778,12 +748,6 @@
         </w:tc>
       </w:tr>
       <w:tr>
-        <w:tblPrEx>
-          <w:tblCellMar>
-            <w:top w:w="0" w:type="dxa"/>
-            <w:bottom w:w="0" w:type="dxa"/>
-          </w:tblCellMar>
-        </w:tblPrEx>
         <w:tc>
           <w:tcPr>
             <w:tcW w:w="3200" w:type="dxa"/>
@@ -838,12 +802,6 @@
         </w:tc>
       </w:tr>
       <w:tr>
-        <w:tblPrEx>
-          <w:tblCellMar>
-            <w:top w:w="0" w:type="dxa"/>
-            <w:bottom w:w="0" w:type="dxa"/>
-          </w:tblCellMar>
-        </w:tblPrEx>
         <w:tc>
           <w:tcPr>
             <w:tcW w:w="3200" w:type="dxa"/>
@@ -894,12 +852,6 @@
         </w:tc>
       </w:tr>
       <w:tr>
-        <w:tblPrEx>
-          <w:tblCellMar>
-            <w:top w:w="0" w:type="dxa"/>
-            <w:bottom w:w="0" w:type="dxa"/>
-          </w:tblCellMar>
-        </w:tblPrEx>
         <w:tc>
           <w:tcPr>
             <w:tcW w:w="3200" w:type="dxa"/>
@@ -972,12 +924,6 @@
         </w:tc>
       </w:tr>
       <w:tr>
-        <w:tblPrEx>
-          <w:tblCellMar>
-            <w:top w:w="0" w:type="dxa"/>
-            <w:bottom w:w="0" w:type="dxa"/>
-          </w:tblCellMar>
-        </w:tblPrEx>
         <w:tc>
           <w:tcPr>
             <w:tcW w:w="3200" w:type="dxa"/>
@@ -1036,12 +982,6 @@
         </w:tc>
       </w:tr>
       <w:tr>
-        <w:tblPrEx>
-          <w:tblCellMar>
-            <w:top w:w="0" w:type="dxa"/>
-            <w:bottom w:w="0" w:type="dxa"/>
-          </w:tblCellMar>
-        </w:tblPrEx>
         <w:tc>
           <w:tcPr>
             <w:tcW w:w="3200" w:type="dxa"/>
@@ -1090,12 +1030,6 @@
         </w:tc>
       </w:tr>
       <w:tr>
-        <w:tblPrEx>
-          <w:tblCellMar>
-            <w:top w:w="0" w:type="dxa"/>
-            <w:bottom w:w="0" w:type="dxa"/>
-          </w:tblCellMar>
-        </w:tblPrEx>
         <w:tc>
           <w:tcPr>
             <w:tcW w:w="3200" w:type="dxa"/>
@@ -1151,12 +1085,6 @@
         </w:tc>
       </w:tr>
       <w:tr>
-        <w:tblPrEx>
-          <w:tblCellMar>
-            <w:top w:w="0" w:type="dxa"/>
-            <w:bottom w:w="0" w:type="dxa"/>
-          </w:tblCellMar>
-        </w:tblPrEx>
         <w:tc>
           <w:tcPr>
             <w:tcW w:w="3200" w:type="dxa"/>
@@ -1210,12 +1138,6 @@
         </w:tc>
       </w:tr>
       <w:tr>
-        <w:tblPrEx>
-          <w:tblCellMar>
-            <w:top w:w="0" w:type="dxa"/>
-            <w:bottom w:w="0" w:type="dxa"/>
-          </w:tblCellMar>
-        </w:tblPrEx>
         <w:tc>
           <w:tcPr>
             <w:tcW w:w="3200" w:type="dxa"/>
@@ -1287,12 +1209,6 @@
         </w:tc>
       </w:tr>
       <w:tr>
-        <w:tblPrEx>
-          <w:tblCellMar>
-            <w:top w:w="0" w:type="dxa"/>
-            <w:bottom w:w="0" w:type="dxa"/>
-          </w:tblCellMar>
-        </w:tblPrEx>
         <w:tc>
           <w:tcPr>
             <w:tcW w:w="3200" w:type="dxa"/>
@@ -1341,12 +1257,6 @@
         </w:tc>
       </w:tr>
       <w:tr>
-        <w:tblPrEx>
-          <w:tblCellMar>
-            <w:top w:w="0" w:type="dxa"/>
-            <w:bottom w:w="0" w:type="dxa"/>
-          </w:tblCellMar>
-        </w:tblPrEx>
         <w:tc>
           <w:tcPr>
             <w:tcW w:w="3200" w:type="dxa"/>
@@ -1397,12 +1307,6 @@
         </w:tc>
       </w:tr>
       <w:tr>
-        <w:tblPrEx>
-          <w:tblCellMar>
-            <w:top w:w="0" w:type="dxa"/>
-            <w:bottom w:w="0" w:type="dxa"/>
-          </w:tblCellMar>
-        </w:tblPrEx>
         <w:tc>
           <w:tcPr>
             <w:tcW w:w="3200" w:type="dxa"/>
@@ -1451,12 +1355,6 @@
         </w:tc>
       </w:tr>
       <w:tr>
-        <w:tblPrEx>
-          <w:tblCellMar>
-            <w:top w:w="0" w:type="dxa"/>
-            <w:bottom w:w="0" w:type="dxa"/>
-          </w:tblCellMar>
-        </w:tblPrEx>
         <w:tc>
           <w:tcPr>
             <w:tcW w:w="3200" w:type="dxa"/>
@@ -1507,12 +1405,6 @@
         </w:tc>
       </w:tr>
       <w:tr>
-        <w:tblPrEx>
-          <w:tblCellMar>
-            <w:top w:w="0" w:type="dxa"/>
-            <w:bottom w:w="0" w:type="dxa"/>
-          </w:tblCellMar>
-        </w:tblPrEx>
         <w:tc>
           <w:tcPr>
             <w:tcW w:w="3200" w:type="dxa"/>
@@ -1561,12 +1453,6 @@
         </w:tc>
       </w:tr>
       <w:tr>
-        <w:tblPrEx>
-          <w:tblCellMar>
-            <w:top w:w="0" w:type="dxa"/>
-            <w:bottom w:w="0" w:type="dxa"/>
-          </w:tblCellMar>
-        </w:tblPrEx>
         <w:tc>
           <w:tcPr>
             <w:tcW w:w="3200" w:type="dxa"/>
@@ -3128,12 +3014,6 @@
         <w:gridCol w:w="6160"/>
       </w:tblGrid>
       <w:tr>
-        <w:tblPrEx>
-          <w:tblCellMar>
-            <w:top w:w="0" w:type="dxa"/>
-            <w:bottom w:w="0" w:type="dxa"/>
-          </w:tblCellMar>
-        </w:tblPrEx>
         <w:tc>
           <w:tcPr>
             <w:tcW w:w="3200" w:type="dxa"/>
@@ -3196,12 +3076,6 @@
         </w:tc>
       </w:tr>
       <w:tr>
-        <w:tblPrEx>
-          <w:tblCellMar>
-            <w:top w:w="0" w:type="dxa"/>
-            <w:bottom w:w="0" w:type="dxa"/>
-          </w:tblCellMar>
-        </w:tblPrEx>
         <w:tc>
           <w:tcPr>
             <w:tcW w:w="3200" w:type="dxa"/>
@@ -3258,12 +3132,6 @@
         </w:tc>
       </w:tr>
       <w:tr>
-        <w:tblPrEx>
-          <w:tblCellMar>
-            <w:top w:w="0" w:type="dxa"/>
-            <w:bottom w:w="0" w:type="dxa"/>
-          </w:tblCellMar>
-        </w:tblPrEx>
         <w:tc>
           <w:tcPr>
             <w:tcW w:w="3200" w:type="dxa"/>
@@ -3322,12 +3190,6 @@
         </w:tc>
       </w:tr>
       <w:tr>
-        <w:tblPrEx>
-          <w:tblCellMar>
-            <w:top w:w="0" w:type="dxa"/>
-            <w:bottom w:w="0" w:type="dxa"/>
-          </w:tblCellMar>
-        </w:tblPrEx>
         <w:tc>
           <w:tcPr>
             <w:tcW w:w="3200" w:type="dxa"/>
@@ -3384,12 +3246,6 @@
         </w:tc>
       </w:tr>
       <w:tr>
-        <w:tblPrEx>
-          <w:tblCellMar>
-            <w:top w:w="0" w:type="dxa"/>
-            <w:bottom w:w="0" w:type="dxa"/>
-          </w:tblCellMar>
-        </w:tblPrEx>
         <w:tc>
           <w:tcPr>
             <w:tcW w:w="3200" w:type="dxa"/>
@@ -3440,12 +3296,6 @@
         </w:tc>
       </w:tr>
       <w:tr>
-        <w:tblPrEx>
-          <w:tblCellMar>
-            <w:top w:w="0" w:type="dxa"/>
-            <w:bottom w:w="0" w:type="dxa"/>
-          </w:tblCellMar>
-        </w:tblPrEx>
         <w:tc>
           <w:tcPr>
             <w:tcW w:w="3200" w:type="dxa"/>
@@ -3499,12 +3349,6 @@
         </w:tc>
       </w:tr>
       <w:tr>
-        <w:tblPrEx>
-          <w:tblCellMar>
-            <w:top w:w="0" w:type="dxa"/>
-            <w:bottom w:w="0" w:type="dxa"/>
-          </w:tblCellMar>
-        </w:tblPrEx>
         <w:tc>
           <w:tcPr>
             <w:tcW w:w="3200" w:type="dxa"/>
@@ -3563,12 +3407,6 @@
         </w:tc>
       </w:tr>
       <w:tr>
-        <w:tblPrEx>
-          <w:tblCellMar>
-            <w:top w:w="0" w:type="dxa"/>
-            <w:bottom w:w="0" w:type="dxa"/>
-          </w:tblCellMar>
-        </w:tblPrEx>
         <w:tc>
           <w:tcPr>
             <w:tcW w:w="3200" w:type="dxa"/>
@@ -3625,12 +3463,6 @@
         </w:tc>
       </w:tr>
       <w:tr>
-        <w:tblPrEx>
-          <w:tblCellMar>
-            <w:top w:w="0" w:type="dxa"/>
-            <w:bottom w:w="0" w:type="dxa"/>
-          </w:tblCellMar>
-        </w:tblPrEx>
         <w:tc>
           <w:tcPr>
             <w:tcW w:w="3200" w:type="dxa"/>
@@ -4047,12 +3879,6 @@
         <w:gridCol w:w="6160"/>
       </w:tblGrid>
       <w:tr>
-        <w:tblPrEx>
-          <w:tblCellMar>
-            <w:top w:w="0" w:type="dxa"/>
-            <w:bottom w:w="0" w:type="dxa"/>
-          </w:tblCellMar>
-        </w:tblPrEx>
         <w:tc>
           <w:tcPr>
             <w:tcW w:w="3200" w:type="dxa"/>
@@ -4115,12 +3941,6 @@
         </w:tc>
       </w:tr>
       <w:tr>
-        <w:tblPrEx>
-          <w:tblCellMar>
-            <w:top w:w="0" w:type="dxa"/>
-            <w:bottom w:w="0" w:type="dxa"/>
-          </w:tblCellMar>
-        </w:tblPrEx>
         <w:tc>
           <w:tcPr>
             <w:tcW w:w="3200" w:type="dxa"/>
@@ -4169,12 +3989,6 @@
         </w:tc>
       </w:tr>
       <w:tr>
-        <w:tblPrEx>
-          <w:tblCellMar>
-            <w:top w:w="0" w:type="dxa"/>
-            <w:bottom w:w="0" w:type="dxa"/>
-          </w:tblCellMar>
-        </w:tblPrEx>
         <w:tc>
           <w:tcPr>
             <w:tcW w:w="3200" w:type="dxa"/>
@@ -4225,12 +4039,6 @@
         </w:tc>
       </w:tr>
       <w:tr>
-        <w:tblPrEx>
-          <w:tblCellMar>
-            <w:top w:w="0" w:type="dxa"/>
-            <w:bottom w:w="0" w:type="dxa"/>
-          </w:tblCellMar>
-        </w:tblPrEx>
         <w:tc>
           <w:tcPr>
             <w:tcW w:w="3200" w:type="dxa"/>
@@ -4279,12 +4087,6 @@
         </w:tc>
       </w:tr>
       <w:tr>
-        <w:tblPrEx>
-          <w:tblCellMar>
-            <w:top w:w="0" w:type="dxa"/>
-            <w:bottom w:w="0" w:type="dxa"/>
-          </w:tblCellMar>
-        </w:tblPrEx>
         <w:tc>
           <w:tcPr>
             <w:tcW w:w="3200" w:type="dxa"/>
@@ -4335,12 +4137,6 @@
         </w:tc>
       </w:tr>
       <w:tr>
-        <w:tblPrEx>
-          <w:tblCellMar>
-            <w:top w:w="0" w:type="dxa"/>
-            <w:bottom w:w="0" w:type="dxa"/>
-          </w:tblCellMar>
-        </w:tblPrEx>
         <w:tc>
           <w:tcPr>
             <w:tcW w:w="3200" w:type="dxa"/>
@@ -4389,12 +4185,6 @@
         </w:tc>
       </w:tr>
       <w:tr>
-        <w:tblPrEx>
-          <w:tblCellMar>
-            <w:top w:w="0" w:type="dxa"/>
-            <w:bottom w:w="0" w:type="dxa"/>
-          </w:tblCellMar>
-        </w:tblPrEx>
         <w:tc>
           <w:tcPr>
             <w:tcW w:w="3200" w:type="dxa"/>
@@ -4445,12 +4235,6 @@
         </w:tc>
       </w:tr>
       <w:tr>
-        <w:tblPrEx>
-          <w:tblCellMar>
-            <w:top w:w="0" w:type="dxa"/>
-            <w:bottom w:w="0" w:type="dxa"/>
-          </w:tblCellMar>
-        </w:tblPrEx>
         <w:tc>
           <w:tcPr>
             <w:tcW w:w="3200" w:type="dxa"/>
@@ -4571,12 +4355,6 @@
         <w:gridCol w:w="6160"/>
       </w:tblGrid>
       <w:tr>
-        <w:tblPrEx>
-          <w:tblCellMar>
-            <w:top w:w="0" w:type="dxa"/>
-            <w:bottom w:w="0" w:type="dxa"/>
-          </w:tblCellMar>
-        </w:tblPrEx>
         <w:tc>
           <w:tcPr>
             <w:tcW w:w="3200" w:type="dxa"/>
@@ -4639,12 +4417,6 @@
         </w:tc>
       </w:tr>
       <w:tr>
-        <w:tblPrEx>
-          <w:tblCellMar>
-            <w:top w:w="0" w:type="dxa"/>
-            <w:bottom w:w="0" w:type="dxa"/>
-          </w:tblCellMar>
-        </w:tblPrEx>
         <w:tc>
           <w:tcPr>
             <w:tcW w:w="3200" w:type="dxa"/>
@@ -4691,12 +4463,6 @@
         </w:tc>
       </w:tr>
       <w:tr>
-        <w:tblPrEx>
-          <w:tblCellMar>
-            <w:top w:w="0" w:type="dxa"/>
-            <w:bottom w:w="0" w:type="dxa"/>
-          </w:tblCellMar>
-        </w:tblPrEx>
         <w:tc>
           <w:tcPr>
             <w:tcW w:w="3200" w:type="dxa"/>
@@ -4745,12 +4511,6 @@
         </w:tc>
       </w:tr>
       <w:tr>
-        <w:tblPrEx>
-          <w:tblCellMar>
-            <w:top w:w="0" w:type="dxa"/>
-            <w:bottom w:w="0" w:type="dxa"/>
-          </w:tblCellMar>
-        </w:tblPrEx>
         <w:tc>
           <w:tcPr>
             <w:tcW w:w="3200" w:type="dxa"/>
@@ -4797,12 +4557,6 @@
         </w:tc>
       </w:tr>
       <w:tr>
-        <w:tblPrEx>
-          <w:tblCellMar>
-            <w:top w:w="0" w:type="dxa"/>
-            <w:bottom w:w="0" w:type="dxa"/>
-          </w:tblCellMar>
-        </w:tblPrEx>
         <w:tc>
           <w:tcPr>
             <w:tcW w:w="3200" w:type="dxa"/>
@@ -4851,12 +4605,6 @@
         </w:tc>
       </w:tr>
       <w:tr>
-        <w:tblPrEx>
-          <w:tblCellMar>
-            <w:top w:w="0" w:type="dxa"/>
-            <w:bottom w:w="0" w:type="dxa"/>
-          </w:tblCellMar>
-        </w:tblPrEx>
         <w:tc>
           <w:tcPr>
             <w:tcW w:w="3200" w:type="dxa"/>
@@ -4903,12 +4651,6 @@
         </w:tc>
       </w:tr>
       <w:tr>
-        <w:tblPrEx>
-          <w:tblCellMar>
-            <w:top w:w="0" w:type="dxa"/>
-            <w:bottom w:w="0" w:type="dxa"/>
-          </w:tblCellMar>
-        </w:tblPrEx>
         <w:tc>
           <w:tcPr>
             <w:tcW w:w="3200" w:type="dxa"/>
@@ -4957,12 +4699,6 @@
         </w:tc>
       </w:tr>
       <w:tr>
-        <w:tblPrEx>
-          <w:tblCellMar>
-            <w:top w:w="0" w:type="dxa"/>
-            <w:bottom w:w="0" w:type="dxa"/>
-          </w:tblCellMar>
-        </w:tblPrEx>
         <w:tc>
           <w:tcPr>
             <w:tcW w:w="3200" w:type="dxa"/>
@@ -5583,12 +5319,6 @@
         <w:gridCol w:w="6160"/>
       </w:tblGrid>
       <w:tr>
-        <w:tblPrEx>
-          <w:tblCellMar>
-            <w:top w:w="0" w:type="dxa"/>
-            <w:bottom w:w="0" w:type="dxa"/>
-          </w:tblCellMar>
-        </w:tblPrEx>
         <w:tc>
           <w:tcPr>
             <w:tcW w:w="3200" w:type="dxa"/>
@@ -5651,12 +5381,6 @@
         </w:tc>
       </w:tr>
       <w:tr>
-        <w:tblPrEx>
-          <w:tblCellMar>
-            <w:top w:w="0" w:type="dxa"/>
-            <w:bottom w:w="0" w:type="dxa"/>
-          </w:tblCellMar>
-        </w:tblPrEx>
         <w:tc>
           <w:tcPr>
             <w:tcW w:w="3200" w:type="dxa"/>
@@ -5708,12 +5432,6 @@
         </w:tc>
       </w:tr>
       <w:tr>
-        <w:tblPrEx>
-          <w:tblCellMar>
-            <w:top w:w="0" w:type="dxa"/>
-            <w:bottom w:w="0" w:type="dxa"/>
-          </w:tblCellMar>
-        </w:tblPrEx>
         <w:tc>
           <w:tcPr>
             <w:tcW w:w="3200" w:type="dxa"/>
@@ -5767,12 +5485,6 @@
         </w:tc>
       </w:tr>
       <w:tr>
-        <w:tblPrEx>
-          <w:tblCellMar>
-            <w:top w:w="0" w:type="dxa"/>
-            <w:bottom w:w="0" w:type="dxa"/>
-          </w:tblCellMar>
-        </w:tblPrEx>
         <w:tc>
           <w:tcPr>
             <w:tcW w:w="3200" w:type="dxa"/>
@@ -5819,12 +5531,6 @@
         </w:tc>
       </w:tr>
       <w:tr>
-        <w:tblPrEx>
-          <w:tblCellMar>
-            <w:top w:w="0" w:type="dxa"/>
-            <w:bottom w:w="0" w:type="dxa"/>
-          </w:tblCellMar>
-        </w:tblPrEx>
         <w:tc>
           <w:tcPr>
             <w:tcW w:w="3200" w:type="dxa"/>
@@ -5873,12 +5579,6 @@
         </w:tc>
       </w:tr>
       <w:tr>
-        <w:tblPrEx>
-          <w:tblCellMar>
-            <w:top w:w="0" w:type="dxa"/>
-            <w:bottom w:w="0" w:type="dxa"/>
-          </w:tblCellMar>
-        </w:tblPrEx>
         <w:tc>
           <w:tcPr>
             <w:tcW w:w="3200" w:type="dxa"/>
@@ -5925,12 +5625,6 @@
         </w:tc>
       </w:tr>
       <w:tr>
-        <w:tblPrEx>
-          <w:tblCellMar>
-            <w:top w:w="0" w:type="dxa"/>
-            <w:bottom w:w="0" w:type="dxa"/>
-          </w:tblCellMar>
-        </w:tblPrEx>
         <w:tc>
           <w:tcPr>
             <w:tcW w:w="3200" w:type="dxa"/>
@@ -6441,12 +6135,6 @@
         <w:gridCol w:w="6160"/>
       </w:tblGrid>
       <w:tr>
-        <w:tblPrEx>
-          <w:tblCellMar>
-            <w:top w:w="0" w:type="dxa"/>
-            <w:bottom w:w="0" w:type="dxa"/>
-          </w:tblCellMar>
-        </w:tblPrEx>
         <w:tc>
           <w:tcPr>
             <w:tcW w:w="3200" w:type="dxa"/>
@@ -6510,12 +6198,6 @@
         </w:tc>
       </w:tr>
       <w:tr>
-        <w:tblPrEx>
-          <w:tblCellMar>
-            <w:top w:w="0" w:type="dxa"/>
-            <w:bottom w:w="0" w:type="dxa"/>
-          </w:tblCellMar>
-        </w:tblPrEx>
         <w:tc>
           <w:tcPr>
             <w:tcW w:w="3200" w:type="dxa"/>
@@ -6562,12 +6244,6 @@
         </w:tc>
       </w:tr>
       <w:tr>
-        <w:tblPrEx>
-          <w:tblCellMar>
-            <w:top w:w="0" w:type="dxa"/>
-            <w:bottom w:w="0" w:type="dxa"/>
-          </w:tblCellMar>
-        </w:tblPrEx>
         <w:tc>
           <w:tcPr>
             <w:tcW w:w="3200" w:type="dxa"/>
@@ -6629,12 +6305,6 @@
         </w:tc>
       </w:tr>
       <w:tr>
-        <w:tblPrEx>
-          <w:tblCellMar>
-            <w:top w:w="0" w:type="dxa"/>
-            <w:bottom w:w="0" w:type="dxa"/>
-          </w:tblCellMar>
-        </w:tblPrEx>
         <w:tc>
           <w:tcPr>
             <w:tcW w:w="3200" w:type="dxa"/>
@@ -6694,12 +6364,6 @@
         </w:tc>
       </w:tr>
       <w:tr>
-        <w:tblPrEx>
-          <w:tblCellMar>
-            <w:top w:w="0" w:type="dxa"/>
-            <w:bottom w:w="0" w:type="dxa"/>
-          </w:tblCellMar>
-        </w:tblPrEx>
         <w:tc>
           <w:tcPr>
             <w:tcW w:w="3200" w:type="dxa"/>
@@ -6761,12 +6425,6 @@
         </w:tc>
       </w:tr>
       <w:tr>
-        <w:tblPrEx>
-          <w:tblCellMar>
-            <w:top w:w="0" w:type="dxa"/>
-            <w:bottom w:w="0" w:type="dxa"/>
-          </w:tblCellMar>
-        </w:tblPrEx>
         <w:tc>
           <w:tcPr>
             <w:tcW w:w="3200" w:type="dxa"/>
@@ -6826,12 +6484,6 @@
         </w:tc>
       </w:tr>
       <w:tr>
-        <w:tblPrEx>
-          <w:tblCellMar>
-            <w:top w:w="0" w:type="dxa"/>
-            <w:bottom w:w="0" w:type="dxa"/>
-          </w:tblCellMar>
-        </w:tblPrEx>
         <w:tc>
           <w:tcPr>
             <w:tcW w:w="3200" w:type="dxa"/>
@@ -6893,12 +6545,6 @@
         </w:tc>
       </w:tr>
       <w:tr>
-        <w:tblPrEx>
-          <w:tblCellMar>
-            <w:top w:w="0" w:type="dxa"/>
-            <w:bottom w:w="0" w:type="dxa"/>
-          </w:tblCellMar>
-        </w:tblPrEx>
         <w:tc>
           <w:tcPr>
             <w:tcW w:w="3200" w:type="dxa"/>
@@ -6953,12 +6599,6 @@
         </w:tc>
       </w:tr>
       <w:tr>
-        <w:tblPrEx>
-          <w:tblCellMar>
-            <w:top w:w="0" w:type="dxa"/>
-            <w:bottom w:w="0" w:type="dxa"/>
-          </w:tblCellMar>
-        </w:tblPrEx>
         <w:tc>
           <w:tcPr>
             <w:tcW w:w="3200" w:type="dxa"/>
@@ -7012,12 +6652,6 @@
         </w:tc>
       </w:tr>
       <w:tr>
-        <w:tblPrEx>
-          <w:tblCellMar>
-            <w:top w:w="0" w:type="dxa"/>
-            <w:bottom w:w="0" w:type="dxa"/>
-          </w:tblCellMar>
-        </w:tblPrEx>
         <w:tc>
           <w:tcPr>
             <w:tcW w:w="3200" w:type="dxa"/>
@@ -7066,12 +6700,6 @@
         </w:tc>
       </w:tr>
       <w:tr>
-        <w:tblPrEx>
-          <w:tblCellMar>
-            <w:top w:w="0" w:type="dxa"/>
-            <w:bottom w:w="0" w:type="dxa"/>
-          </w:tblCellMar>
-        </w:tblPrEx>
         <w:tc>
           <w:tcPr>
             <w:tcW w:w="3200" w:type="dxa"/>
@@ -7120,12 +6748,6 @@
         </w:tc>
       </w:tr>
       <w:tr>
-        <w:tblPrEx>
-          <w:tblCellMar>
-            <w:top w:w="0" w:type="dxa"/>
-            <w:bottom w:w="0" w:type="dxa"/>
-          </w:tblCellMar>
-        </w:tblPrEx>
         <w:tc>
           <w:tcPr>
             <w:tcW w:w="3200" w:type="dxa"/>
@@ -7402,12 +7024,6 @@
         <w:gridCol w:w="2600"/>
       </w:tblGrid>
       <w:tr>
-        <w:tblPrEx>
-          <w:tblCellMar>
-            <w:top w:w="0" w:type="dxa"/>
-            <w:bottom w:w="0" w:type="dxa"/>
-          </w:tblCellMar>
-        </w:tblPrEx>
         <w:tc>
           <w:tcPr>
             <w:tcW w:w="2600" w:type="dxa"/>
@@ -7501,12 +7117,6 @@
         </w:tc>
       </w:tr>
       <w:tr>
-        <w:tblPrEx>
-          <w:tblCellMar>
-            <w:top w:w="0" w:type="dxa"/>
-            <w:bottom w:w="0" w:type="dxa"/>
-          </w:tblCellMar>
-        </w:tblPrEx>
         <w:tc>
           <w:tcPr>
             <w:tcW w:w="2600" w:type="dxa"/>
@@ -7575,12 +7185,6 @@
         </w:tc>
       </w:tr>
       <w:tr>
-        <w:tblPrEx>
-          <w:tblCellMar>
-            <w:top w:w="0" w:type="dxa"/>
-            <w:bottom w:w="0" w:type="dxa"/>
-          </w:tblCellMar>
-        </w:tblPrEx>
         <w:tc>
           <w:tcPr>
             <w:tcW w:w="2600" w:type="dxa"/>
@@ -7652,12 +7256,6 @@
         </w:tc>
       </w:tr>
       <w:tr>
-        <w:tblPrEx>
-          <w:tblCellMar>
-            <w:top w:w="0" w:type="dxa"/>
-            <w:bottom w:w="0" w:type="dxa"/>
-          </w:tblCellMar>
-        </w:tblPrEx>
         <w:tc>
           <w:tcPr>
             <w:tcW w:w="2600" w:type="dxa"/>
@@ -7726,12 +7324,6 @@
         </w:tc>
       </w:tr>
       <w:tr>
-        <w:tblPrEx>
-          <w:tblCellMar>
-            <w:top w:w="0" w:type="dxa"/>
-            <w:bottom w:w="0" w:type="dxa"/>
-          </w:tblCellMar>
-        </w:tblPrEx>
         <w:tc>
           <w:tcPr>
             <w:tcW w:w="2600" w:type="dxa"/>
@@ -7803,12 +7395,6 @@
         </w:tc>
       </w:tr>
       <w:tr>
-        <w:tblPrEx>
-          <w:tblCellMar>
-            <w:top w:w="0" w:type="dxa"/>
-            <w:bottom w:w="0" w:type="dxa"/>
-          </w:tblCellMar>
-        </w:tblPrEx>
         <w:tc>
           <w:tcPr>
             <w:tcW w:w="2600" w:type="dxa"/>
@@ -7885,12 +7471,6 @@
         </w:tc>
       </w:tr>
       <w:tr>
-        <w:tblPrEx>
-          <w:tblCellMar>
-            <w:top w:w="0" w:type="dxa"/>
-            <w:bottom w:w="0" w:type="dxa"/>
-          </w:tblCellMar>
-        </w:tblPrEx>
         <w:tc>
           <w:tcPr>
             <w:tcW w:w="2600" w:type="dxa"/>
@@ -7962,12 +7542,6 @@
         </w:tc>
       </w:tr>
       <w:tr>
-        <w:tblPrEx>
-          <w:tblCellMar>
-            <w:top w:w="0" w:type="dxa"/>
-            <w:bottom w:w="0" w:type="dxa"/>
-          </w:tblCellMar>
-        </w:tblPrEx>
         <w:tc>
           <w:tcPr>
             <w:tcW w:w="2600" w:type="dxa"/>
@@ -8036,12 +7610,6 @@
         </w:tc>
       </w:tr>
       <w:tr>
-        <w:tblPrEx>
-          <w:tblCellMar>
-            <w:top w:w="0" w:type="dxa"/>
-            <w:bottom w:w="0" w:type="dxa"/>
-          </w:tblCellMar>
-        </w:tblPrEx>
         <w:tc>
           <w:tcPr>
             <w:tcW w:w="2600" w:type="dxa"/>
@@ -8113,12 +7681,6 @@
         </w:tc>
       </w:tr>
       <w:tr>
-        <w:tblPrEx>
-          <w:tblCellMar>
-            <w:top w:w="0" w:type="dxa"/>
-            <w:bottom w:w="0" w:type="dxa"/>
-          </w:tblCellMar>
-        </w:tblPrEx>
         <w:tc>
           <w:tcPr>
             <w:tcW w:w="2600" w:type="dxa"/>
@@ -8187,12 +7749,6 @@
         </w:tc>
       </w:tr>
       <w:tr>
-        <w:tblPrEx>
-          <w:tblCellMar>
-            <w:top w:w="0" w:type="dxa"/>
-            <w:bottom w:w="0" w:type="dxa"/>
-          </w:tblCellMar>
-        </w:tblPrEx>
         <w:tc>
           <w:tcPr>
             <w:tcW w:w="2600" w:type="dxa"/>
@@ -8264,12 +7820,6 @@
         </w:tc>
       </w:tr>
       <w:tr>
-        <w:tblPrEx>
-          <w:tblCellMar>
-            <w:top w:w="0" w:type="dxa"/>
-            <w:bottom w:w="0" w:type="dxa"/>
-          </w:tblCellMar>
-        </w:tblPrEx>
         <w:tc>
           <w:tcPr>
             <w:tcW w:w="2600" w:type="dxa"/>
@@ -8338,12 +7888,6 @@
         </w:tc>
       </w:tr>
       <w:tr>
-        <w:tblPrEx>
-          <w:tblCellMar>
-            <w:top w:w="0" w:type="dxa"/>
-            <w:bottom w:w="0" w:type="dxa"/>
-          </w:tblCellMar>
-        </w:tblPrEx>
         <w:tc>
           <w:tcPr>
             <w:tcW w:w="2600" w:type="dxa"/>
@@ -8415,12 +7959,6 @@
         </w:tc>
       </w:tr>
       <w:tr>
-        <w:tblPrEx>
-          <w:tblCellMar>
-            <w:top w:w="0" w:type="dxa"/>
-            <w:bottom w:w="0" w:type="dxa"/>
-          </w:tblCellMar>
-        </w:tblPrEx>
         <w:tc>
           <w:tcPr>
             <w:tcW w:w="2600" w:type="dxa"/>
@@ -8571,12 +8109,6 @@
         <w:gridCol w:w="6160"/>
       </w:tblGrid>
       <w:tr>
-        <w:tblPrEx>
-          <w:tblCellMar>
-            <w:top w:w="0" w:type="dxa"/>
-            <w:bottom w:w="0" w:type="dxa"/>
-          </w:tblCellMar>
-        </w:tblPrEx>
         <w:tc>
           <w:tcPr>
             <w:tcW w:w="3200" w:type="dxa"/>
@@ -8639,12 +8171,6 @@
         </w:tc>
       </w:tr>
       <w:tr>
-        <w:tblPrEx>
-          <w:tblCellMar>
-            <w:top w:w="0" w:type="dxa"/>
-            <w:bottom w:w="0" w:type="dxa"/>
-          </w:tblCellMar>
-        </w:tblPrEx>
         <w:tc>
           <w:tcPr>
             <w:tcW w:w="3200" w:type="dxa"/>
@@ -8698,12 +8224,6 @@
         </w:tc>
       </w:tr>
       <w:tr>
-        <w:tblPrEx>
-          <w:tblCellMar>
-            <w:top w:w="0" w:type="dxa"/>
-            <w:bottom w:w="0" w:type="dxa"/>
-          </w:tblCellMar>
-        </w:tblPrEx>
         <w:tc>
           <w:tcPr>
             <w:tcW w:w="3200" w:type="dxa"/>
@@ -8755,12 +8275,6 @@
         </w:tc>
       </w:tr>
       <w:tr>
-        <w:tblPrEx>
-          <w:tblCellMar>
-            <w:top w:w="0" w:type="dxa"/>
-            <w:bottom w:w="0" w:type="dxa"/>
-          </w:tblCellMar>
-        </w:tblPrEx>
         <w:tc>
           <w:tcPr>
             <w:tcW w:w="3200" w:type="dxa"/>
@@ -8809,12 +8323,6 @@
         </w:tc>
       </w:tr>
       <w:tr>
-        <w:tblPrEx>
-          <w:tblCellMar>
-            <w:top w:w="0" w:type="dxa"/>
-            <w:bottom w:w="0" w:type="dxa"/>
-          </w:tblCellMar>
-        </w:tblPrEx>
         <w:tc>
           <w:tcPr>
             <w:tcW w:w="3200" w:type="dxa"/>
@@ -8873,12 +8381,6 @@
         </w:tc>
       </w:tr>
       <w:tr>
-        <w:tblPrEx>
-          <w:tblCellMar>
-            <w:top w:w="0" w:type="dxa"/>
-            <w:bottom w:w="0" w:type="dxa"/>
-          </w:tblCellMar>
-        </w:tblPrEx>
         <w:tc>
           <w:tcPr>
             <w:tcW w:w="3200" w:type="dxa"/>
@@ -8935,12 +8437,6 @@
         </w:tc>
       </w:tr>
       <w:tr>
-        <w:tblPrEx>
-          <w:tblCellMar>
-            <w:top w:w="0" w:type="dxa"/>
-            <w:bottom w:w="0" w:type="dxa"/>
-          </w:tblCellMar>
-        </w:tblPrEx>
         <w:tc>
           <w:tcPr>
             <w:tcW w:w="3200" w:type="dxa"/>
@@ -8989,12 +8485,6 @@
         </w:tc>
       </w:tr>
       <w:tr>
-        <w:tblPrEx>
-          <w:tblCellMar>
-            <w:top w:w="0" w:type="dxa"/>
-            <w:bottom w:w="0" w:type="dxa"/>
-          </w:tblCellMar>
-        </w:tblPrEx>
         <w:tc>
           <w:tcPr>
             <w:tcW w:w="3200" w:type="dxa"/>
@@ -9043,12 +8533,6 @@
         </w:tc>
       </w:tr>
       <w:tr>
-        <w:tblPrEx>
-          <w:tblCellMar>
-            <w:top w:w="0" w:type="dxa"/>
-            <w:bottom w:w="0" w:type="dxa"/>
-          </w:tblCellMar>
-        </w:tblPrEx>
         <w:tc>
           <w:tcPr>
             <w:tcW w:w="3200" w:type="dxa"/>
@@ -9107,12 +8591,6 @@
         </w:tc>
       </w:tr>
       <w:tr>
-        <w:tblPrEx>
-          <w:tblCellMar>
-            <w:top w:w="0" w:type="dxa"/>
-            <w:bottom w:w="0" w:type="dxa"/>
-          </w:tblCellMar>
-        </w:tblPrEx>
         <w:tc>
           <w:tcPr>
             <w:tcW w:w="3200" w:type="dxa"/>
@@ -9204,12 +8682,6 @@
         <w:gridCol w:w="6160"/>
       </w:tblGrid>
       <w:tr>
-        <w:tblPrEx>
-          <w:tblCellMar>
-            <w:top w:w="0" w:type="dxa"/>
-            <w:bottom w:w="0" w:type="dxa"/>
-          </w:tblCellMar>
-        </w:tblPrEx>
         <w:tc>
           <w:tcPr>
             <w:tcW w:w="3200" w:type="dxa"/>
@@ -9272,12 +8744,6 @@
         </w:tc>
       </w:tr>
       <w:tr>
-        <w:tblPrEx>
-          <w:tblCellMar>
-            <w:top w:w="0" w:type="dxa"/>
-            <w:bottom w:w="0" w:type="dxa"/>
-          </w:tblCellMar>
-        </w:tblPrEx>
         <w:tc>
           <w:tcPr>
             <w:tcW w:w="3200" w:type="dxa"/>
@@ -9324,12 +8790,6 @@
         </w:tc>
       </w:tr>
       <w:tr>
-        <w:tblPrEx>
-          <w:tblCellMar>
-            <w:top w:w="0" w:type="dxa"/>
-            <w:bottom w:w="0" w:type="dxa"/>
-          </w:tblCellMar>
-        </w:tblPrEx>
         <w:tc>
           <w:tcPr>
             <w:tcW w:w="3200" w:type="dxa"/>
@@ -9378,12 +8838,6 @@
         </w:tc>
       </w:tr>
       <w:tr>
-        <w:tblPrEx>
-          <w:tblCellMar>
-            <w:top w:w="0" w:type="dxa"/>
-            <w:bottom w:w="0" w:type="dxa"/>
-          </w:tblCellMar>
-        </w:tblPrEx>
         <w:tc>
           <w:tcPr>
             <w:tcW w:w="3200" w:type="dxa"/>
@@ -9432,12 +8886,6 @@
         </w:tc>
       </w:tr>
       <w:tr>
-        <w:tblPrEx>
-          <w:tblCellMar>
-            <w:top w:w="0" w:type="dxa"/>
-            <w:bottom w:w="0" w:type="dxa"/>
-          </w:tblCellMar>
-        </w:tblPrEx>
         <w:tc>
           <w:tcPr>
             <w:tcW w:w="3200" w:type="dxa"/>

</xml_diff>